<commit_message>
Version 2.5, first NASA Org Release
</commit_message>
<xml_diff>
--- a/ExoVista Change Log.docx
+++ b/ExoVista Change Log.docx
@@ -1,6 +1,6 @@
 
 <file path=word/document.xml><?xml version="1.0" encoding="utf-8"?>
-<w:document xmlns:wpc="http://schemas.microsoft.com/office/word/2010/wordprocessingCanvas" xmlns:cx="http://schemas.microsoft.com/office/drawing/2014/chartex" xmlns:cx1="http://schemas.microsoft.com/office/drawing/2015/9/8/chartex" xmlns:cx2="http://schemas.microsoft.com/office/drawing/2015/10/21/chartex" xmlns:cx3="http://schemas.microsoft.com/office/drawing/2016/5/9/chartex" xmlns:cx4="http://schemas.microsoft.com/office/drawing/2016/5/10/chartex" xmlns:cx5="http://schemas.microsoft.com/office/drawing/2016/5/11/chartex" xmlns:cx6="http://schemas.microsoft.com/office/drawing/2016/5/12/chartex" xmlns:cx7="http://schemas.microsoft.com/office/drawing/2016/5/13/chartex" xmlns:cx8="http://schemas.microsoft.com/office/drawing/2016/5/14/chartex" xmlns:mc="http://schemas.openxmlformats.org/markup-compatibility/2006" xmlns:aink="http://schemas.microsoft.com/office/drawing/2016/ink" xmlns:am3d="http://schemas.microsoft.com/office/drawing/2017/model3d" xmlns:o="urn:schemas-microsoft-com:office:office" xmlns:oel="http://schemas.microsoft.com/office/2019/extlst" xmlns:r="http://schemas.openxmlformats.org/officeDocument/2006/relationships" xmlns:m="http://schemas.openxmlformats.org/officeDocument/2006/math" xmlns:v="urn:schemas-microsoft-com:vml" xmlns:wp14="http://schemas.microsoft.com/office/word/2010/wordprocessingDrawing" xmlns:wp="http://schemas.openxmlformats.org/drawingml/2006/wordprocessingDrawing" xmlns:w10="urn:schemas-microsoft-com:office:word" xmlns:w="http://schemas.openxmlformats.org/wordprocessingml/2006/main" xmlns:w14="http://schemas.microsoft.com/office/word/2010/wordml" xmlns:w15="http://schemas.microsoft.com/office/word/2012/wordml" xmlns:w16cex="http://schemas.microsoft.com/office/word/2018/wordml/cex" xmlns:w16cid="http://schemas.microsoft.com/office/word/2016/wordml/cid" xmlns:w16="http://schemas.microsoft.com/office/word/2018/wordml" xmlns:w16sdtdh="http://schemas.microsoft.com/office/word/2020/wordml/sdtdatahash" xmlns:w16se="http://schemas.microsoft.com/office/word/2015/wordml/symex" xmlns:wpg="http://schemas.microsoft.com/office/word/2010/wordprocessingGroup" xmlns:wpi="http://schemas.microsoft.com/office/word/2010/wordprocessingInk" xmlns:wne="http://schemas.microsoft.com/office/word/2006/wordml" xmlns:wps="http://schemas.microsoft.com/office/word/2010/wordprocessingShape" mc:Ignorable="w14 w15 w16se w16cid w16 w16cex w16sdtdh wp14">
+<w:document xmlns:wpc="http://schemas.microsoft.com/office/word/2010/wordprocessingCanvas" xmlns:cx="http://schemas.microsoft.com/office/drawing/2014/chartex" xmlns:cx1="http://schemas.microsoft.com/office/drawing/2015/9/8/chartex" xmlns:cx2="http://schemas.microsoft.com/office/drawing/2015/10/21/chartex" xmlns:cx3="http://schemas.microsoft.com/office/drawing/2016/5/9/chartex" xmlns:cx4="http://schemas.microsoft.com/office/drawing/2016/5/10/chartex" xmlns:cx5="http://schemas.microsoft.com/office/drawing/2016/5/11/chartex" xmlns:cx6="http://schemas.microsoft.com/office/drawing/2016/5/12/chartex" xmlns:cx7="http://schemas.microsoft.com/office/drawing/2016/5/13/chartex" xmlns:cx8="http://schemas.microsoft.com/office/drawing/2016/5/14/chartex" xmlns:mc="http://schemas.openxmlformats.org/markup-compatibility/2006" xmlns:aink="http://schemas.microsoft.com/office/drawing/2016/ink" xmlns:am3d="http://schemas.microsoft.com/office/drawing/2017/model3d" xmlns:o="urn:schemas-microsoft-com:office:office" xmlns:oel="http://schemas.microsoft.com/office/2019/extlst" xmlns:r="http://schemas.openxmlformats.org/officeDocument/2006/relationships" xmlns:m="http://schemas.openxmlformats.org/officeDocument/2006/math" xmlns:v="urn:schemas-microsoft-com:vml" xmlns:wp14="http://schemas.microsoft.com/office/word/2010/wordprocessingDrawing" xmlns:wp="http://schemas.openxmlformats.org/drawingml/2006/wordprocessingDrawing" xmlns:w10="urn:schemas-microsoft-com:office:word" xmlns:w="http://schemas.openxmlformats.org/wordprocessingml/2006/main" xmlns:w14="http://schemas.microsoft.com/office/word/2010/wordml" xmlns:w15="http://schemas.microsoft.com/office/word/2012/wordml" xmlns:w16cex="http://schemas.microsoft.com/office/word/2018/wordml/cex" xmlns:w16cid="http://schemas.microsoft.com/office/word/2016/wordml/cid" xmlns:w16="http://schemas.microsoft.com/office/word/2018/wordml" xmlns:w16du="http://schemas.microsoft.com/office/word/2023/wordml/word16du" xmlns:w16sdtdh="http://schemas.microsoft.com/office/word/2020/wordml/sdtdatahash" xmlns:w16sdtfl="http://schemas.microsoft.com/office/word/2024/wordml/sdtformatlock" xmlns:w16se="http://schemas.microsoft.com/office/word/2015/wordml/symex" xmlns:wpg="http://schemas.microsoft.com/office/word/2010/wordprocessingGroup" xmlns:wpi="http://schemas.microsoft.com/office/word/2010/wordprocessingInk" xmlns:wne="http://schemas.microsoft.com/office/word/2006/wordml" xmlns:wps="http://schemas.microsoft.com/office/word/2010/wordprocessingShape" mc:Ignorable="w14 w15 w16se w16cid w16 w16cex w16sdtdh w16sdtfl w16du wp14">
   <w:body>
     <w:p>
       <w:pPr>
@@ -9,21 +9,12 @@
           <w:bCs/>
         </w:rPr>
       </w:pPr>
-      <w:proofErr w:type="spellStart"/>
-      <w:r>
-        <w:rPr>
-          <w:b/>
-          <w:bCs/>
-        </w:rPr>
-        <w:t>ExoVista</w:t>
-      </w:r>
-      <w:proofErr w:type="spellEnd"/>
-      <w:r>
-        <w:rPr>
-          <w:b/>
-          <w:bCs/>
-        </w:rPr>
-        <w:t xml:space="preserve"> Change Log</w:t>
+      <w:r>
+        <w:rPr>
+          <w:b/>
+          <w:bCs/>
+        </w:rPr>
+        <w:t>ExoVista Change Log</w:t>
       </w:r>
     </w:p>
     <w:p>
@@ -50,6 +41,21 @@
       </w:r>
     </w:p>
     <w:p>
+      <w:pPr>
+        <w:rPr>
+          <w:b/>
+          <w:bCs/>
+        </w:rPr>
+      </w:pPr>
+      <w:r>
+        <w:rPr>
+          <w:b/>
+          <w:bCs/>
+        </w:rPr>
+        <w:t>December 18, 2025</w:t>
+      </w:r>
+    </w:p>
+    <w:p>
       <w:r>
         <w:t xml:space="preserve">Tweaked the limits in the </w:t>
       </w:r>
@@ -97,6 +103,225 @@
       </w:r>
     </w:p>
     <w:p>
+      <w:r>
+        <w:t xml:space="preserve">Substantial rewrite to incorporate </w:t>
+      </w:r>
+      <w:proofErr w:type="spellStart"/>
+      <w:r>
+        <w:t>starspots</w:t>
+      </w:r>
+      <w:proofErr w:type="spellEnd"/>
+      <w:r>
+        <w:t xml:space="preserve"> and other sources of stellar variability. </w:t>
+      </w:r>
+      <w:proofErr w:type="spellStart"/>
+      <w:r>
+        <w:t>Starspots</w:t>
+      </w:r>
+      <w:proofErr w:type="spellEnd"/>
+      <w:r>
+        <w:t xml:space="preserve"> proper and granulation fully operational. Faculae and flares in progress.</w:t>
+      </w:r>
+    </w:p>
+    <w:p>
+      <w:r>
+        <w:t>Rewrite also involved replacing the Kurucz stellar spectra models with the more expansive Phoenix models, allowing coverage of ultra-cool dwarfs.</w:t>
+      </w:r>
+    </w:p>
+    <w:p>
+      <w:r>
+        <w:t>Rewrite also included adding limb darkening.</w:t>
+      </w:r>
+    </w:p>
+    <w:p>
+      <w:r>
+        <w:t>Rewrite included the new make_starmap.py functions.</w:t>
+      </w:r>
+    </w:p>
+    <w:p>
+      <w:r>
+        <w:t xml:space="preserve">The list of </w:t>
+      </w:r>
+      <w:proofErr w:type="spellStart"/>
+      <w:r>
+        <w:t>starspots</w:t>
+      </w:r>
+      <w:proofErr w:type="spellEnd"/>
+      <w:r>
+        <w:t xml:space="preserve"> is output as HDU 4 in the FITS file. The stellar properties and spectra are moved to HDU 5</w:t>
+      </w:r>
+      <w:r>
+        <w:t xml:space="preserve"> and planets to subsequent HDUs.</w:t>
+      </w:r>
+    </w:p>
+    <w:p>
+      <w:r>
+        <w:t>Updated readfits.py to handle the new format (with backwards compatibility).</w:t>
+      </w:r>
+      <w:r>
+        <w:br/>
+        <w:t>Properties of the stellar activity model needed to recreate the stellar spectrum are listed in the cards for HDU 5.</w:t>
+      </w:r>
+    </w:p>
+    <w:p>
+      <w:r>
+        <w:t xml:space="preserve">Changed the format of the FITS files from float64 to float32 to save on memory </w:t>
+      </w:r>
+      <w:r>
+        <w:t>stora</w:t>
+      </w:r>
+      <w:r>
+        <w:t>ge.</w:t>
+      </w:r>
+    </w:p>
+    <w:p>
+      <w:r>
+        <w:t xml:space="preserve">Substantial rewrite to </w:t>
+      </w:r>
+      <w:proofErr w:type="spellStart"/>
+      <w:r>
+        <w:t>generate_</w:t>
+      </w:r>
+      <w:proofErr w:type="gramStart"/>
+      <w:r>
+        <w:t>planets</w:t>
+      </w:r>
+      <w:proofErr w:type="spellEnd"/>
+      <w:r>
+        <w:t>(</w:t>
+      </w:r>
+      <w:proofErr w:type="gramEnd"/>
+      <w:r>
+        <w:t xml:space="preserve">) </w:t>
+      </w:r>
+      <w:r>
+        <w:t>to convolve the occurrence rates with the uncertainty in the Chen &amp; Kipping mass-radius relation.</w:t>
+      </w:r>
+    </w:p>
+    <w:p>
+      <w:r>
+        <w:t>Rewrite also included merging the RP (transit) occurrence rate function for small planets and the MA (radial velocity) occurrence rate function for giant planets into a single co</w:t>
+      </w:r>
+      <w:r>
+        <w:t>mbin</w:t>
+      </w:r>
+      <w:r>
+        <w:t>ed function.</w:t>
+      </w:r>
+    </w:p>
+    <w:p>
+      <w:r>
+        <w:t xml:space="preserve">Added a switch to include </w:t>
+      </w:r>
+      <w:proofErr w:type="spellStart"/>
+      <w:r>
+        <w:t>starspots</w:t>
+      </w:r>
+      <w:proofErr w:type="spellEnd"/>
+      <w:r>
+        <w:t xml:space="preserve"> and a stellar surface grid resolution to Settings.py.</w:t>
+      </w:r>
+    </w:p>
+    <w:p>
+      <w:r>
+        <w:t>Fixed a bug in the handling of settings presets.</w:t>
+      </w:r>
+    </w:p>
+    <w:p>
+      <w:r>
+        <w:t>Made some minor optimizations in Image.cpp.</w:t>
+      </w:r>
+    </w:p>
+    <w:p>
+      <w:r>
+        <w:t>Added parameters and defaults needed for stellar activity to constants.py.</w:t>
+      </w:r>
+    </w:p>
+    <w:p>
+      <w:r>
+        <w:t xml:space="preserve">The </w:t>
+      </w:r>
+      <w:proofErr w:type="spellStart"/>
+      <w:r>
+        <w:t>starspot</w:t>
+      </w:r>
+      <w:proofErr w:type="spellEnd"/>
+      <w:r>
+        <w:t xml:space="preserve"> model does NOT yet have a statistical distribution included. A fiducial model is </w:t>
+      </w:r>
+      <w:proofErr w:type="gramStart"/>
+      <w:r>
+        <w:t>hard-coded</w:t>
+      </w:r>
+      <w:proofErr w:type="gramEnd"/>
+      <w:r>
+        <w:t xml:space="preserve"> in load_stars.py.</w:t>
+      </w:r>
+    </w:p>
+    <w:p>
+      <w:r>
+        <w:t xml:space="preserve">Add the required NASA </w:t>
+      </w:r>
+      <w:proofErr w:type="gramStart"/>
+      <w:r>
+        <w:t>Open Source</w:t>
+      </w:r>
+      <w:proofErr w:type="gramEnd"/>
+      <w:r>
+        <w:t xml:space="preserve"> Software Agreement.</w:t>
+      </w:r>
+    </w:p>
+    <w:p>
+      <w:r>
+        <w:t>Added required legal</w:t>
+      </w:r>
+      <w:r>
+        <w:t xml:space="preserve"> notices and</w:t>
+      </w:r>
+      <w:r>
+        <w:t xml:space="preserve"> disclaimers for the official release of the software under the NASA </w:t>
+      </w:r>
+      <w:proofErr w:type="gramStart"/>
+      <w:r>
+        <w:t>Open Source</w:t>
+      </w:r>
+      <w:proofErr w:type="gramEnd"/>
+      <w:r>
+        <w:t xml:space="preserve"> Agreement.</w:t>
+      </w:r>
+    </w:p>
+    <w:p>
+      <w:r>
+        <w:t xml:space="preserve">Added the make_starmap.py file to compute stellar spectra with </w:t>
+      </w:r>
+      <w:proofErr w:type="spellStart"/>
+      <w:r>
+        <w:t>starspots</w:t>
+      </w:r>
+      <w:proofErr w:type="spellEnd"/>
+      <w:r>
+        <w:t>.</w:t>
+      </w:r>
+    </w:p>
+    <w:p>
+      <w:r>
+        <w:t>Added the generate_starspots.py file.</w:t>
+      </w:r>
+    </w:p>
+    <w:p>
+      <w:r>
+        <w:t xml:space="preserve">The time evolution of </w:t>
+      </w:r>
+      <w:proofErr w:type="spellStart"/>
+      <w:r>
+        <w:t>starspots</w:t>
+      </w:r>
+      <w:proofErr w:type="spellEnd"/>
+      <w:r>
+        <w:t xml:space="preserve"> and the mapping functions are NOT fully tested.</w:t>
+      </w:r>
+    </w:p>
+    <w:p>
       <w:pPr>
         <w:rPr>
           <w:b/>
@@ -173,7 +398,15 @@
       </w:r>
       <w:proofErr w:type="gramEnd"/>
       <w:r>
-        <w:t>) with a full Scene() class that reads in a FITS file and has utility functions to report specific values.</w:t>
+        <w:t xml:space="preserve">) with a full </w:t>
+      </w:r>
+      <w:proofErr w:type="gramStart"/>
+      <w:r>
+        <w:t>Scene(</w:t>
+      </w:r>
+      <w:proofErr w:type="gramEnd"/>
+      <w:r>
+        <w:t>) class that reads in a FITS file and has utility functions to report specific values.</w:t>
       </w:r>
     </w:p>
     <w:p>
@@ -216,6 +449,7 @@
     </w:p>
     <w:p>
       <w:r>
+        <w:lastRenderedPageBreak/>
         <w:t xml:space="preserve">Added command-line arguments to readfits.py </w:t>
       </w:r>
       <w:r>
@@ -234,7 +468,13 @@
     </w:p>
     <w:p>
       <w:r>
-        <w:t xml:space="preserve">Added a radius limit for warm/cold </w:t>
+        <w:t xml:space="preserve">Added a radius limit for </w:t>
+      </w:r>
+      <w:r>
+        <w:t>not-hot</w:t>
+      </w:r>
+      <w:r>
+        <w:t xml:space="preserve"> </w:t>
       </w:r>
       <w:proofErr w:type="spellStart"/>
       <w:r>
@@ -473,20 +713,11 @@
           <w:bCs/>
         </w:rPr>
       </w:pPr>
-    </w:p>
-    <w:p>
-      <w:pPr>
-        <w:rPr>
-          <w:b/>
-          <w:bCs/>
-        </w:rPr>
-      </w:pPr>
-      <w:r>
-        <w:rPr>
-          <w:b/>
-          <w:bCs/>
-        </w:rPr>
-        <w:lastRenderedPageBreak/>
+      <w:r>
+        <w:rPr>
+          <w:b/>
+          <w:bCs/>
+        </w:rPr>
         <w:t>v2.33</w:t>
       </w:r>
     </w:p>
@@ -507,7 +738,13 @@
     </w:p>
     <w:p>
       <w:r>
-        <w:t xml:space="preserve">Minor QoL changes to the </w:t>
+        <w:t xml:space="preserve">Minor </w:t>
+      </w:r>
+      <w:r>
+        <w:t xml:space="preserve">quality-of-life </w:t>
+      </w:r>
+      <w:r>
+        <w:t xml:space="preserve">changes to the </w:t>
       </w:r>
       <w:r>
         <w:t xml:space="preserve">solar_system.dat </w:t>
@@ -628,6 +865,7 @@
     </w:p>
     <w:p>
       <w:r>
+        <w:lastRenderedPageBreak/>
         <w:t xml:space="preserve">Added the </w:t>
       </w:r>
       <w:r>
@@ -969,15 +1207,7 @@
     </w:p>
     <w:p>
       <w:r>
-        <w:t xml:space="preserve">Added a Teff &gt; 3500 K restriction to load_stars.py based on the range of the </w:t>
-      </w:r>
-      <w:proofErr w:type="spellStart"/>
-      <w:r>
-        <w:t>Kurucz</w:t>
-      </w:r>
-      <w:proofErr w:type="spellEnd"/>
-      <w:r>
-        <w:t xml:space="preserve"> models.</w:t>
+        <w:t>Added a Teff &gt; 3500 K restriction to load_stars.py based on the range of the Kurucz models.</w:t>
       </w:r>
     </w:p>
     <w:p>
@@ -987,98 +1217,116 @@
     </w:p>
     <w:p>
       <w:r>
+        <w:t>Added an option to use a stellar spectrum file in place of the Kurucz models</w:t>
+      </w:r>
+      <w:r>
+        <w:t xml:space="preserve"> (still subject to the bounds of the Kurucz models).</w:t>
+      </w:r>
+    </w:p>
+    <w:p>
+      <w:r>
+        <w:t>Added an optional random spread in the mass-radius relation based on the “fractional dispersion” hyperparameters of Chen &amp; Kipping (2017)</w:t>
+      </w:r>
+      <w:r>
+        <w:t>.</w:t>
+      </w:r>
+    </w:p>
+    <w:p>
+      <w:r>
+        <w:t xml:space="preserve">Fixed a bug that caused zero stars to be assigned to a core for some </w:t>
+      </w:r>
+      <w:r>
+        <w:t>sizes of target lists</w:t>
+      </w:r>
+      <w:r>
+        <w:t xml:space="preserve"> (which causes a crash).</w:t>
+      </w:r>
+    </w:p>
+    <w:p>
+      <w:r>
+        <w:t>Added an example stellar spectrum (Kurucz model for the Sun).</w:t>
+      </w:r>
+    </w:p>
+    <w:p>
+      <w:r>
+        <w:t>Updated the</w:t>
+      </w:r>
+      <w:r>
+        <w:t xml:space="preserve"> example output file (our Solar system at 10 pc, </w:t>
+      </w:r>
+      <w:proofErr w:type="gramStart"/>
+      <w:r>
+        <w:t>10</w:t>
+      </w:r>
+      <w:r>
+        <w:t xml:space="preserve"> year</w:t>
+      </w:r>
+      <w:proofErr w:type="gramEnd"/>
+      <w:r>
+        <w:t xml:space="preserve"> integration).</w:t>
+      </w:r>
+    </w:p>
+    <w:p>
+      <w:r>
+        <w:t>Added command-line input of file names to ExoVistaSystem.py.</w:t>
+      </w:r>
+    </w:p>
+    <w:p>
+      <w:r>
+        <w:t>Modified ExoVistaSystem.py to detect and set the number of disk components based on the input file.</w:t>
+      </w:r>
+    </w:p>
+    <w:p>
+      <w:r>
+        <w:t>Significant overhaul of readfits.py, including improved input handling, backwards compatibility, and outputting the list of transit and eclipse events.</w:t>
+      </w:r>
+    </w:p>
+    <w:p>
+      <w:r>
+        <w:t xml:space="preserve">Laid the groundwork for dust emission/absorption spectra generation with the </w:t>
+      </w:r>
+      <w:proofErr w:type="spellStart"/>
+      <w:r>
+        <w:t>load_</w:t>
+      </w:r>
+      <w:proofErr w:type="gramStart"/>
+      <w:r>
+        <w:t>lqabs</w:t>
+      </w:r>
+      <w:proofErr w:type="spellEnd"/>
+      <w:r>
+        <w:t>(</w:t>
+      </w:r>
+      <w:proofErr w:type="gramEnd"/>
+      <w:r>
+        <w:t>) routine in generate_scene.py (not yet used).</w:t>
+      </w:r>
+    </w:p>
+    <w:p>
+      <w:r>
         <w:lastRenderedPageBreak/>
-        <w:t xml:space="preserve">Added an option to use a stellar spectrum file in place of the </w:t>
-      </w:r>
-      <w:proofErr w:type="spellStart"/>
-      <w:r>
-        <w:t>Kurucz</w:t>
-      </w:r>
-      <w:proofErr w:type="spellEnd"/>
-      <w:r>
-        <w:t xml:space="preserve"> models</w:t>
-      </w:r>
-      <w:r>
-        <w:t xml:space="preserve"> (still subject to the bounds of the </w:t>
-      </w:r>
-      <w:proofErr w:type="spellStart"/>
-      <w:r>
-        <w:t>Kurucz</w:t>
-      </w:r>
-      <w:proofErr w:type="spellEnd"/>
-      <w:r>
-        <w:t xml:space="preserve"> models).</w:t>
-      </w:r>
-    </w:p>
-    <w:p>
-      <w:r>
-        <w:t>Added an optional random spread in the mass-radius relation based on the “fractional dispersion” hyperparameters of Chen &amp; Kipping (2017)</w:t>
-      </w:r>
-      <w:r>
-        <w:t>.</w:t>
-      </w:r>
-    </w:p>
-    <w:p>
-      <w:r>
-        <w:t xml:space="preserve">Fixed a bug that caused zero stars to be assigned to a core for some </w:t>
-      </w:r>
-      <w:r>
-        <w:t>sizes of target lists</w:t>
-      </w:r>
-      <w:r>
-        <w:t xml:space="preserve"> (which causes a crash).</w:t>
-      </w:r>
-    </w:p>
-    <w:p>
-      <w:r>
-        <w:t>Added an example stellar spectrum (</w:t>
-      </w:r>
-      <w:proofErr w:type="spellStart"/>
-      <w:r>
-        <w:t>Kurucz</w:t>
-      </w:r>
-      <w:proofErr w:type="spellEnd"/>
-      <w:r>
-        <w:t xml:space="preserve"> model for the Sun).</w:t>
-      </w:r>
-    </w:p>
-    <w:p>
-      <w:r>
-        <w:t>Updated the</w:t>
-      </w:r>
-      <w:r>
-        <w:t xml:space="preserve"> example output file (our Solar system at 10 pc, </w:t>
-      </w:r>
-      <w:proofErr w:type="gramStart"/>
-      <w:r>
-        <w:t>10</w:t>
-      </w:r>
-      <w:r>
-        <w:t xml:space="preserve"> year</w:t>
-      </w:r>
-      <w:proofErr w:type="gramEnd"/>
-      <w:r>
-        <w:t xml:space="preserve"> integration).</w:t>
-      </w:r>
-    </w:p>
-    <w:p>
-      <w:r>
-        <w:t>Added command-line input of file names to ExoVistaSystem.py.</w:t>
-      </w:r>
-    </w:p>
-    <w:p>
-      <w:r>
-        <w:t>Modified ExoVistaSystem.py to detect and set the number of disk components based on the input file.</w:t>
-      </w:r>
-    </w:p>
-    <w:p>
-      <w:r>
-        <w:t>Significant overhaul of readfits.py, including improved input handling, backwards compatibility, and outputting the list of transit and eclipse events.</w:t>
-      </w:r>
-    </w:p>
-    <w:p>
-      <w:r>
-        <w:t xml:space="preserve">Laid the groundwork for dust emission/absorption spectra generation with the </w:t>
+        <w:t xml:space="preserve">Fixed a bug that broke RNG seed repeatability in </w:t>
+      </w:r>
+      <w:proofErr w:type="spellStart"/>
+      <w:r>
+        <w:t>generate_</w:t>
+      </w:r>
+      <w:proofErr w:type="gramStart"/>
+      <w:r>
+        <w:t>scene</w:t>
+      </w:r>
+      <w:proofErr w:type="spellEnd"/>
+      <w:r>
+        <w:t>(</w:t>
+      </w:r>
+      <w:proofErr w:type="gramEnd"/>
+      <w:r>
+        <w:t>).</w:t>
+      </w:r>
+    </w:p>
+    <w:p>
+      <w:r>
+        <w:t xml:space="preserve">Fixed a planet-counting bug in </w:t>
       </w:r>
       <w:proofErr w:type="spellStart"/>
       <w:r>
@@ -1086,7 +1334,7 @@
       </w:r>
       <w:proofErr w:type="gramStart"/>
       <w:r>
-        <w:t>lqabs</w:t>
+        <w:t>scene</w:t>
       </w:r>
       <w:proofErr w:type="spellEnd"/>
       <w:r>
@@ -1094,12 +1342,147 @@
       </w:r>
       <w:proofErr w:type="gramEnd"/>
       <w:r>
-        <w:t>) routine in generate_scene.py (not yet used).</w:t>
-      </w:r>
-    </w:p>
-    <w:p>
-      <w:r>
-        <w:t xml:space="preserve">Fixed a bug that broke RNG seed repeatability in </w:t>
+        <w:t>).</w:t>
+      </w:r>
+    </w:p>
+    <w:p>
+      <w:r>
+        <w:t xml:space="preserve">Added the new </w:t>
+      </w:r>
+      <w:proofErr w:type="spellStart"/>
+      <w:r>
+        <w:t>add_background</w:t>
+      </w:r>
+      <w:proofErr w:type="spellEnd"/>
+      <w:r>
+        <w:t xml:space="preserve"> module, which generates random extragalactic background sources for a scene.</w:t>
+      </w:r>
+    </w:p>
+    <w:p/>
+    <w:p>
+      <w:pPr>
+        <w:rPr>
+          <w:b/>
+          <w:bCs/>
+        </w:rPr>
+      </w:pPr>
+      <w:r>
+        <w:rPr>
+          <w:b/>
+          <w:bCs/>
+        </w:rPr>
+        <w:t>v</w:t>
+      </w:r>
+      <w:r>
+        <w:rPr>
+          <w:b/>
+          <w:bCs/>
+        </w:rPr>
+        <w:t>2.2</w:t>
+      </w:r>
+    </w:p>
+    <w:p>
+      <w:pPr>
+        <w:rPr>
+          <w:b/>
+          <w:bCs/>
+        </w:rPr>
+      </w:pPr>
+      <w:r>
+        <w:rPr>
+          <w:b/>
+          <w:bCs/>
+        </w:rPr>
+        <w:t>March 2</w:t>
+      </w:r>
+      <w:r>
+        <w:rPr>
+          <w:b/>
+          <w:bCs/>
+        </w:rPr>
+        <w:t>3</w:t>
+      </w:r>
+      <w:r>
+        <w:rPr>
+          <w:b/>
+          <w:bCs/>
+        </w:rPr>
+        <w:t>, 2023</w:t>
+      </w:r>
+    </w:p>
+    <w:p>
+      <w:r>
+        <w:t>Fixed a bug in the output of stellar coordinates.</w:t>
+      </w:r>
+    </w:p>
+    <w:p>
+      <w:r>
+        <w:t>Added phase angle to the planet data listed in the FITS files.</w:t>
+      </w:r>
+    </w:p>
+    <w:p>
+      <w:r>
+        <w:t>Added a version number line to the FITS files to allow backward-compatibility of post-processing scripts.</w:t>
+      </w:r>
+    </w:p>
+    <w:p>
+      <w:r>
+        <w:t>Added transit and eclipse detection.</w:t>
+      </w:r>
+    </w:p>
+    <w:p>
+      <w:r>
+        <w:t>Added a fifth plot for planet trajectories to readfits.py.</w:t>
+      </w:r>
+    </w:p>
+    <w:p>
+      <w:r>
+        <w:t>Added printing of transit and eclipse times to readfits.py.</w:t>
+      </w:r>
+    </w:p>
+    <w:p>
+      <w:r>
+        <w:t>Shifted the N-body integrator from Python to C++ to speed up integration with transit detection.</w:t>
+      </w:r>
+    </w:p>
+    <w:p>
+      <w:r>
+        <w:t>Updated post-processing scripts to handle multiple code versions.</w:t>
+      </w:r>
+    </w:p>
+    <w:p>
+      <w:r>
+        <w:t>Added functionality to readfits.py to reenter the FITS file name or number if an error occurs.</w:t>
+      </w:r>
+    </w:p>
+    <w:p>
+      <w:r>
+        <w:t>Added functionality to ExoVistaSystem.py to prompt for an input filename, accept one as a command line argument, and check for the correct “Star, Planets, Disks” format.</w:t>
+      </w:r>
+    </w:p>
+    <w:p>
+      <w:r>
+        <w:t>Set up ExoVistaSystem.py to read the number of disk components from the input file.</w:t>
+      </w:r>
+    </w:p>
+    <w:p>
+      <w:r>
+        <w:t>Fixed a bug in the coordinate transformations.</w:t>
+      </w:r>
+    </w:p>
+    <w:p>
+      <w:r>
+        <w:t>Fixed the parameters of the added Earth twins.</w:t>
+      </w:r>
+    </w:p>
+    <w:p>
+      <w:r>
+        <w:t>Adjusted the Earth twins to zero eccentricity so that the starting phase angle would be exactly 90 degrees.</w:t>
+      </w:r>
+    </w:p>
+    <w:p>
+      <w:r>
+        <w:t xml:space="preserve">Ensured </w:t>
       </w:r>
       <w:proofErr w:type="spellStart"/>
       <w:r>
@@ -1115,183 +1498,6 @@
       </w:r>
       <w:proofErr w:type="gramEnd"/>
       <w:r>
-        <w:t>).</w:t>
-      </w:r>
-    </w:p>
-    <w:p>
-      <w:r>
-        <w:t xml:space="preserve">Fixed a planet-counting bug in </w:t>
-      </w:r>
-      <w:proofErr w:type="spellStart"/>
-      <w:r>
-        <w:t>load_</w:t>
-      </w:r>
-      <w:proofErr w:type="gramStart"/>
-      <w:r>
-        <w:t>scene</w:t>
-      </w:r>
-      <w:proofErr w:type="spellEnd"/>
-      <w:r>
-        <w:t>(</w:t>
-      </w:r>
-      <w:proofErr w:type="gramEnd"/>
-      <w:r>
-        <w:t>).</w:t>
-      </w:r>
-    </w:p>
-    <w:p>
-      <w:r>
-        <w:t xml:space="preserve">Added the new </w:t>
-      </w:r>
-      <w:proofErr w:type="spellStart"/>
-      <w:r>
-        <w:t>add_background</w:t>
-      </w:r>
-      <w:proofErr w:type="spellEnd"/>
-      <w:r>
-        <w:t xml:space="preserve"> module, which generates random extragalactic background sources for a scene.</w:t>
-      </w:r>
-    </w:p>
-    <w:p/>
-    <w:p>
-      <w:pPr>
-        <w:rPr>
-          <w:b/>
-          <w:bCs/>
-        </w:rPr>
-      </w:pPr>
-      <w:r>
-        <w:rPr>
-          <w:b/>
-          <w:bCs/>
-        </w:rPr>
-        <w:t>v</w:t>
-      </w:r>
-      <w:r>
-        <w:rPr>
-          <w:b/>
-          <w:bCs/>
-        </w:rPr>
-        <w:t>2.2</w:t>
-      </w:r>
-    </w:p>
-    <w:p>
-      <w:pPr>
-        <w:rPr>
-          <w:b/>
-          <w:bCs/>
-        </w:rPr>
-      </w:pPr>
-      <w:r>
-        <w:rPr>
-          <w:b/>
-          <w:bCs/>
-        </w:rPr>
-        <w:t>March 2</w:t>
-      </w:r>
-      <w:r>
-        <w:rPr>
-          <w:b/>
-          <w:bCs/>
-        </w:rPr>
-        <w:t>3</w:t>
-      </w:r>
-      <w:r>
-        <w:rPr>
-          <w:b/>
-          <w:bCs/>
-        </w:rPr>
-        <w:t>, 2023</w:t>
-      </w:r>
-    </w:p>
-    <w:p>
-      <w:r>
-        <w:t>Fixed a bug in the output of stellar coordinates.</w:t>
-      </w:r>
-    </w:p>
-    <w:p>
-      <w:r>
-        <w:t>Added phase angle to the planet data listed in the FITS files.</w:t>
-      </w:r>
-    </w:p>
-    <w:p>
-      <w:r>
-        <w:t>Added a version number line to the FITS files to allow backward-compatibility of post-processing scripts.</w:t>
-      </w:r>
-    </w:p>
-    <w:p>
-      <w:r>
-        <w:t>Added transit and eclipse detection.</w:t>
-      </w:r>
-    </w:p>
-    <w:p>
-      <w:r>
-        <w:t>Added a fifth plot for planet trajectories to readfits.py.</w:t>
-      </w:r>
-    </w:p>
-    <w:p>
-      <w:r>
-        <w:t>Added printing of transit and eclipse times to readfits.py.</w:t>
-      </w:r>
-    </w:p>
-    <w:p>
-      <w:r>
-        <w:t>Shifted the N-body integrator from Python to C++ to speed up integration with transit detection.</w:t>
-      </w:r>
-    </w:p>
-    <w:p>
-      <w:r>
-        <w:t>Updated post-processing scripts to handle multiple code versions.</w:t>
-      </w:r>
-    </w:p>
-    <w:p>
-      <w:r>
-        <w:t>Added functionality to readfits.py to reenter the FITS file name or number if an error occurs.</w:t>
-      </w:r>
-    </w:p>
-    <w:p>
-      <w:r>
-        <w:t>Added functionality to ExoVistaSystem.py to prompt for an input filename, accept one as a command line argument, and check for the correct “Star, Planets, Disks” format.</w:t>
-      </w:r>
-    </w:p>
-    <w:p>
-      <w:r>
-        <w:t>Set up ExoVistaSystem.py to read the number of disk components from the input file.</w:t>
-      </w:r>
-    </w:p>
-    <w:p>
-      <w:r>
-        <w:t>Fixed a bug in the coordinate transformations.</w:t>
-      </w:r>
-    </w:p>
-    <w:p>
-      <w:r>
-        <w:t>Fixed the parameters of the added Earth twins.</w:t>
-      </w:r>
-    </w:p>
-    <w:p>
-      <w:r>
-        <w:t>Adjusted the Earth twins to zero eccentricity so that the starting phase angle would be exactly 90 degrees.</w:t>
-      </w:r>
-    </w:p>
-    <w:p>
-      <w:r>
-        <w:t xml:space="preserve">Ensured </w:t>
-      </w:r>
-      <w:proofErr w:type="spellStart"/>
-      <w:r>
-        <w:t>generate_</w:t>
-      </w:r>
-      <w:proofErr w:type="gramStart"/>
-      <w:r>
-        <w:t>scene</w:t>
-      </w:r>
-      <w:proofErr w:type="spellEnd"/>
-      <w:r>
-        <w:t>(</w:t>
-      </w:r>
-      <w:proofErr w:type="gramEnd"/>
-      <w:r>
         <w:t xml:space="preserve">) would report parameters </w:t>
       </w:r>
       <w:r>
@@ -1313,7 +1519,6 @@
     </w:p>
     <w:p>
       <w:r>
-        <w:lastRenderedPageBreak/>
         <w:t>Fixed a bug in handling the Earth twin in load_scene.py</w:t>
       </w:r>
       <w:r>
@@ -1422,7 +1627,15 @@
       </w:r>
       <w:proofErr w:type="spellEnd"/>
       <w:r>
-        <w:t xml:space="preserve"> containing all of the values that should be </w:t>
+        <w:t xml:space="preserve"> containing </w:t>
+      </w:r>
+      <w:proofErr w:type="gramStart"/>
+      <w:r>
+        <w:t>all of</w:t>
+      </w:r>
+      <w:proofErr w:type="gramEnd"/>
+      <w:r>
+        <w:t xml:space="preserve"> the values that should be </w:t>
       </w:r>
       <w:proofErr w:type="gramStart"/>
       <w:r>
@@ -1435,6 +1648,7 @@
     </w:p>
     <w:p>
       <w:r>
+        <w:lastRenderedPageBreak/>
         <w:t xml:space="preserve">Added various parameters to the </w:t>
       </w:r>
       <w:proofErr w:type="gramStart"/>
@@ -1515,7 +1729,15 @@
       </w:r>
       <w:proofErr w:type="spellEnd"/>
       <w:r>
-        <w:t xml:space="preserve">; also disk particle size </w:t>
+        <w:t xml:space="preserve">; </w:t>
+      </w:r>
+      <w:proofErr w:type="gramStart"/>
+      <w:r>
+        <w:t>also</w:t>
+      </w:r>
+      <w:proofErr w:type="gramEnd"/>
+      <w:r>
+        <w:t xml:space="preserve"> disk particle size </w:t>
       </w:r>
       <w:proofErr w:type="spellStart"/>
       <w:r>
@@ -1534,7 +1756,23 @@
         <w:t>;</w:t>
       </w:r>
       <w:r>
-        <w:t xml:space="preserve"> also all of the </w:t>
+        <w:t xml:space="preserve"> </w:t>
+      </w:r>
+      <w:proofErr w:type="gramStart"/>
+      <w:r>
+        <w:t>also</w:t>
+      </w:r>
+      <w:proofErr w:type="gramEnd"/>
+      <w:r>
+        <w:t xml:space="preserve"> </w:t>
+      </w:r>
+      <w:proofErr w:type="gramStart"/>
+      <w:r>
+        <w:t>all of</w:t>
+      </w:r>
+      <w:proofErr w:type="gramEnd"/>
+      <w:r>
+        <w:t xml:space="preserve"> the </w:t>
       </w:r>
       <w:r>
         <w:t xml:space="preserve">hard-coded </w:t>
@@ -1555,15 +1793,7 @@
     </w:p>
     <w:p>
       <w:r>
-        <w:t xml:space="preserve">Replaced the </w:t>
-      </w:r>
-      <w:proofErr w:type="gramStart"/>
-      <w:r>
-        <w:t>file-based</w:t>
-      </w:r>
-      <w:proofErr w:type="gramEnd"/>
-      <w:r>
-        <w:t xml:space="preserve"> </w:t>
+        <w:t xml:space="preserve">Replaced the file-based </w:t>
       </w:r>
       <w:proofErr w:type="spellStart"/>
       <w:r>
@@ -1799,7 +2029,7 @@
 </file>
 
 <file path=word/styles.xml><?xml version="1.0" encoding="utf-8"?>
-<w:styles xmlns:mc="http://schemas.openxmlformats.org/markup-compatibility/2006" xmlns:r="http://schemas.openxmlformats.org/officeDocument/2006/relationships" xmlns:w="http://schemas.openxmlformats.org/wordprocessingml/2006/main" xmlns:w14="http://schemas.microsoft.com/office/word/2010/wordml" xmlns:w15="http://schemas.microsoft.com/office/word/2012/wordml" xmlns:w16cex="http://schemas.microsoft.com/office/word/2018/wordml/cex" xmlns:w16cid="http://schemas.microsoft.com/office/word/2016/wordml/cid" xmlns:w16="http://schemas.microsoft.com/office/word/2018/wordml" xmlns:w16sdtdh="http://schemas.microsoft.com/office/word/2020/wordml/sdtdatahash" xmlns:w16se="http://schemas.microsoft.com/office/word/2015/wordml/symex" mc:Ignorable="w14 w15 w16se w16cid w16 w16cex w16sdtdh">
+<w:styles xmlns:mc="http://schemas.openxmlformats.org/markup-compatibility/2006" xmlns:r="http://schemas.openxmlformats.org/officeDocument/2006/relationships" xmlns:w="http://schemas.openxmlformats.org/wordprocessingml/2006/main" xmlns:w14="http://schemas.microsoft.com/office/word/2010/wordml" xmlns:w15="http://schemas.microsoft.com/office/word/2012/wordml" xmlns:w16cex="http://schemas.microsoft.com/office/word/2018/wordml/cex" xmlns:w16cid="http://schemas.microsoft.com/office/word/2016/wordml/cid" xmlns:w16="http://schemas.microsoft.com/office/word/2018/wordml" xmlns:w16du="http://schemas.microsoft.com/office/word/2023/wordml/word16du" xmlns:w16sdtdh="http://schemas.microsoft.com/office/word/2020/wordml/sdtdatahash" xmlns:w16sdtfl="http://schemas.microsoft.com/office/word/2024/wordml/sdtformatlock" xmlns:w16se="http://schemas.microsoft.com/office/word/2015/wordml/symex" mc:Ignorable="w14 w15 w16se w16cid w16 w16cex w16sdtdh w16sdtfl w16du">
   <w:docDefaults>
     <w:rPrDefault>
       <w:rPr>

</xml_diff>